<commit_message>
Resposta de Confirmação de Repositório
</commit_message>
<xml_diff>
--- a/Reports/Emails/modelo_email_confirmação_repositorio.docx
+++ b/Reports/Emails/modelo_email_confirmação_repositorio.docx
@@ -10,57 +10,19 @@
           <w:szCs w:val="24"/>
         </w:rPr>
       </w:pPr>
-      <w:bookmarkStart w:id="0" w:name="_GoBack"/>
-      <w:bookmarkEnd w:id="0"/>
-      <w:r>
-        <w:rPr>
-          <w:sz w:val="24"/>
-          <w:szCs w:val="24"/>
-        </w:rPr>
-        <w:t>Prezados administradores do Repositório da</w:t>
-      </w:r>
-      <w:r>
-        <w:rPr>
-          <w:sz w:val="24"/>
-          <w:szCs w:val="24"/>
-        </w:rPr>
-        <w:t xml:space="preserve"> </w:t>
-      </w:r>
-      <w:r>
-        <w:rPr>
-          <w:sz w:val="24"/>
-          <w:szCs w:val="24"/>
-        </w:rPr>
-        <w:fldChar w:fldCharType="begin"/>
-      </w:r>
-      <w:r>
-        <w:rPr>
-          <w:sz w:val="24"/>
-          <w:szCs w:val="24"/>
-        </w:rPr>
-        <w:instrText xml:space="preserve"> MERGEFIELD "Nome" </w:instrText>
-      </w:r>
-      <w:r>
-        <w:rPr>
-          <w:sz w:val="24"/>
-          <w:szCs w:val="24"/>
-        </w:rPr>
-        <w:fldChar w:fldCharType="separate"/>
-      </w:r>
-      <w:r>
-        <w:rPr>
-          <w:noProof/>
-          <w:sz w:val="24"/>
-          <w:szCs w:val="24"/>
-        </w:rPr>
-        <w:t>UNIVERSIDADE FEDERAL DA PARAÍBA</w:t>
-      </w:r>
-      <w:r>
-        <w:rPr>
-          <w:sz w:val="24"/>
-          <w:szCs w:val="24"/>
-        </w:rPr>
-        <w:fldChar w:fldCharType="end"/>
+      <w:r>
+        <w:rPr>
+          <w:sz w:val="24"/>
+          <w:szCs w:val="24"/>
+        </w:rPr>
+        <w:t xml:space="preserve">Prezados administradores do Repositório da </w:t>
+      </w:r>
+      <w:r>
+        <w:rPr>
+          <w:sz w:val="24"/>
+          <w:szCs w:val="24"/>
+        </w:rPr>
+        <w:t>&lt;&lt;Nome Instituição&gt;&gt;</w:t>
       </w:r>
       <w:r>
         <w:rPr>
@@ -115,21 +77,16 @@
           <w:sz w:val="24"/>
           <w:szCs w:val="24"/>
         </w:rPr>
-        <w:t xml:space="preserve"> dos graduandos do curso de Licenciatura em Computação em nível nacional</w:t>
-      </w:r>
-      <w:r>
-        <w:rPr>
-          <w:sz w:val="24"/>
-          <w:szCs w:val="24"/>
-        </w:rPr>
-        <w:t xml:space="preserve"> e gostaria de utilizar o seu repositório como uma das minhas bases de dados</w:t>
-      </w:r>
-      <w:r>
-        <w:rPr>
-          <w:sz w:val="24"/>
-          <w:szCs w:val="24"/>
-        </w:rPr>
-        <w:t>.</w:t>
+        <w:t xml:space="preserve"> dos graduandos do curso de Licenciatura em Computação em nível naci</w:t>
+      </w:r>
+      <w:bookmarkStart w:id="0" w:name="_GoBack"/>
+      <w:bookmarkEnd w:id="0"/>
+      <w:r>
+        <w:rPr>
+          <w:sz w:val="24"/>
+          <w:szCs w:val="24"/>
+        </w:rPr>
+        <w:t>onal e gostaria de utilizar o seu repositório como uma das minhas bases de dados.</w:t>
       </w:r>
     </w:p>
     <w:p>
@@ -145,64 +102,21 @@
           <w:sz w:val="24"/>
           <w:szCs w:val="24"/>
         </w:rPr>
-        <w:t>Por isso, g</w:t>
-      </w:r>
-      <w:r>
-        <w:rPr>
-          <w:sz w:val="24"/>
-          <w:szCs w:val="24"/>
-        </w:rPr>
-        <w:t>ostaria de confirmar se o repositório disponível no site [</w:t>
-      </w:r>
-      <w:r>
-        <w:rPr>
-          <w:sz w:val="24"/>
-          <w:szCs w:val="24"/>
-        </w:rPr>
-        <w:fldChar w:fldCharType="begin"/>
-      </w:r>
-      <w:r>
-        <w:rPr>
-          <w:sz w:val="24"/>
-          <w:szCs w:val="24"/>
-        </w:rPr>
-        <w:instrText xml:space="preserve"> MERGEFIELD "Repositorio" </w:instrText>
-      </w:r>
-      <w:r>
-        <w:rPr>
-          <w:sz w:val="24"/>
-          <w:szCs w:val="24"/>
-        </w:rPr>
-        <w:fldChar w:fldCharType="separate"/>
-      </w:r>
-      <w:r>
-        <w:rPr>
-          <w:noProof/>
-          <w:sz w:val="24"/>
-          <w:szCs w:val="24"/>
-        </w:rPr>
-        <w:t>https://repositorio.ufpb.br/jspui/</w:t>
-      </w:r>
-      <w:r>
-        <w:rPr>
-          <w:sz w:val="24"/>
-          <w:szCs w:val="24"/>
-        </w:rPr>
-        <w:fldChar w:fldCharType="end"/>
-      </w:r>
-      <w:r>
-        <w:rPr>
-          <w:sz w:val="24"/>
-          <w:szCs w:val="24"/>
-        </w:rPr>
-        <w:t>]</w:t>
-      </w:r>
-      <w:r>
-        <w:rPr>
-          <w:sz w:val="24"/>
-          <w:szCs w:val="24"/>
-        </w:rPr>
-        <w:t xml:space="preserve"> é o mais adequado para minha pesquisa. Estou procurando por uma base de dados confiável e atualizada para coletar informações sobre os </w:t>
+        <w:t>Por isso, gostaria de confirmar se o repositório disponível no site [</w:t>
+      </w:r>
+      <w:r>
+        <w:rPr>
+          <w:sz w:val="24"/>
+          <w:szCs w:val="24"/>
+        </w:rPr>
+        <w:t>&lt;&lt;URL Repositório&gt;&gt;</w:t>
+      </w:r>
+      <w:r>
+        <w:rPr>
+          <w:sz w:val="24"/>
+          <w:szCs w:val="24"/>
+        </w:rPr>
+        <w:t xml:space="preserve">] é o mais adequado para minha pesquisa. Estou procurando por uma base de dados confiável e atualizada para coletar informações sobre os </w:t>
       </w:r>
       <w:proofErr w:type="spellStart"/>
       <w:r>
@@ -326,7 +240,6 @@
         <w:t>Universidade de Brasília (UnB)</w:t>
       </w:r>
     </w:p>
-    <w:p/>
     <w:sectPr>
       <w:pgSz w:w="11906" w:h="16838"/>
       <w:pgMar w:top="1417" w:right="1701" w:bottom="1417" w:left="1701" w:header="708" w:footer="708" w:gutter="0"/>
@@ -335,99 +248,6 @@
     </w:sectPr>
   </w:body>
 </w:document>
-</file>
-
-<file path=word/recipientData.xml><?xml version="1.0" encoding="utf-8"?>
-<wne:recipients xmlns:wpc="http://schemas.microsoft.com/office/word/2010/wordprocessingCanvas" xmlns:cx="http://schemas.microsoft.com/office/drawing/2014/chartex" xmlns:cx1="http://schemas.microsoft.com/office/drawing/2015/9/8/chartex" xmlns:cx2="http://schemas.microsoft.com/office/drawing/2015/10/21/chartex" xmlns:cx3="http://schemas.microsoft.com/office/drawing/2016/5/9/chartex" xmlns:cx4="http://schemas.microsoft.com/office/drawing/2016/5/10/chartex" xmlns:cx5="http://schemas.microsoft.com/office/drawing/2016/5/11/chartex" xmlns:cx6="http://schemas.microsoft.com/office/drawing/2016/5/12/chartex" xmlns:cx7="http://schemas.microsoft.com/office/drawing/2016/5/13/chartex" xmlns:cx8="http://schemas.microsoft.com/office/drawing/2016/5/14/chartex" xmlns:mc="http://schemas.openxmlformats.org/markup-compatibility/2006" xmlns:aink="http://schemas.microsoft.com/office/drawing/2016/ink" xmlns:am3d="http://schemas.microsoft.com/office/drawing/2017/model3d" xmlns:o="urn:schemas-microsoft-com:office:office" xmlns:r="http://schemas.openxmlformats.org/officeDocument/2006/relationships" xmlns:m="http://schemas.openxmlformats.org/officeDocument/2006/math" xmlns:v="urn:schemas-microsoft-com:vml" xmlns:wp14="http://schemas.microsoft.com/office/word/2010/wordprocessingDrawing" xmlns:wp="http://schemas.openxmlformats.org/drawingml/2006/wordprocessingDrawing" xmlns:w10="urn:schemas-microsoft-com:office:word" xmlns:w="http://schemas.openxmlformats.org/wordprocessingml/2006/main" xmlns:w14="http://schemas.microsoft.com/office/word/2010/wordml" xmlns:w15="http://schemas.microsoft.com/office/word/2012/wordml" xmlns:w16cid="http://schemas.microsoft.com/office/word/2016/wordml/cid" xmlns:w16se="http://schemas.microsoft.com/office/word/2015/wordml/symex" xmlns:wpg="http://schemas.microsoft.com/office/word/2010/wordprocessingGroup" xmlns:wpi="http://schemas.microsoft.com/office/word/2010/wordprocessingInk" xmlns:wne="http://schemas.microsoft.com/office/word/2006/wordml" xmlns:wps="http://schemas.microsoft.com/office/word/2010/wordprocessingShape" mc:Ignorable="w14 w15 w16se w16cid wp14">
-  <wne:recipientData>
-    <wne:active wne:val="1"/>
-    <wne:hash wne:val="-2118222876"/>
-  </wne:recipientData>
-  <wne:recipientData>
-    <wne:active wne:val="1"/>
-    <wne:hash wne:val="1105816274"/>
-  </wne:recipientData>
-  <wne:recipientData>
-    <wne:active wne:val="1"/>
-    <wne:hash wne:val="-905723780"/>
-  </wne:recipientData>
-  <wne:recipientData>
-    <wne:active wne:val="1"/>
-    <wne:hash wne:val="1352025177"/>
-  </wne:recipientData>
-  <wne:recipientData>
-    <wne:active wne:val="1"/>
-    <wne:hash wne:val="1602287552"/>
-  </wne:recipientData>
-  <wne:recipientData>
-    <wne:active wne:val="1"/>
-    <wne:hash wne:val="1260538782"/>
-  </wne:recipientData>
-  <wne:recipientData>
-    <wne:active wne:val="1"/>
-    <wne:hash wne:val="-581466555"/>
-  </wne:recipientData>
-  <wne:recipientData>
-    <wne:active wne:val="1"/>
-    <wne:hash wne:val="-1246511978"/>
-  </wne:recipientData>
-  <wne:recipientData>
-    <wne:active wne:val="1"/>
-    <wne:hash wne:val="1416481389"/>
-  </wne:recipientData>
-  <wne:recipientData>
-    <wne:active wne:val="1"/>
-    <wne:hash wne:val="-1974853970"/>
-  </wne:recipientData>
-  <wne:recipientData>
-    <wne:active wne:val="1"/>
-    <wne:hash wne:val="-2097030093"/>
-  </wne:recipientData>
-  <wne:recipientData>
-    <wne:active wne:val="1"/>
-    <wne:hash wne:val="1691335523"/>
-  </wne:recipientData>
-  <wne:recipientData>
-    <wne:active wne:val="1"/>
-    <wne:hash wne:val="-1521113484"/>
-  </wne:recipientData>
-  <wne:recipientData>
-    <wne:active wne:val="1"/>
-    <wne:hash wne:val="-1001174208"/>
-  </wne:recipientData>
-  <wne:recipientData>
-    <wne:active wne:val="1"/>
-    <wne:hash wne:val="1229966337"/>
-  </wne:recipientData>
-  <wne:recipientData>
-    <wne:active wne:val="1"/>
-    <wne:hash wne:val="407932480"/>
-  </wne:recipientData>
-  <wne:recipientData>
-    <wne:active wne:val="1"/>
-    <wne:hash wne:val="-956492005"/>
-  </wne:recipientData>
-  <wne:recipientData>
-    <wne:active wne:val="1"/>
-    <wne:hash wne:val="44981772"/>
-  </wne:recipientData>
-  <wne:recipientData>
-    <wne:active wne:val="1"/>
-    <wne:hash wne:val="-157632117"/>
-  </wne:recipientData>
-  <wne:recipientData>
-    <wne:active wne:val="1"/>
-    <wne:hash wne:val="1616392979"/>
-  </wne:recipientData>
-  <wne:recipientData>
-    <wne:active wne:val="1"/>
-    <wne:hash wne:val="-1106603790"/>
-  </wne:recipientData>
-  <wne:recipientData>
-    <wne:active wne:val="1"/>
-    <wne:hash wne:val="-549030407"/>
-  </wne:recipientData>
-</wne:recipients>
 </file>
 
 <file path=word/styles.xml><?xml version="1.0" encoding="utf-8"?>
@@ -827,7 +647,6 @@
   <w:style w:type="paragraph" w:default="1" w:styleId="Normal">
     <w:name w:val="Normal"/>
     <w:qFormat/>
-    <w:rsid w:val="000075A4"/>
   </w:style>
   <w:style w:type="character" w:default="1" w:styleId="Fontepargpadro">
     <w:name w:val="Default Paragraph Font"/>

</xml_diff>